<commit_message>
docs(emploi): manuel a jour — dashboard collapse + /handovers respiration
- Section 4 (Tableau de bord) reecrite pour le collapse editorial : bloc
  « Memoire active ce matin », « Vie des lieux » en familles colorees
  (anomalies en rouge), pied « memoire accumulee », suppression des KPI/
  pipeline AO/contrats sous tension. Note : signaux calcules, jamais inventes.
- Section 15 : nouvelle sous-section sur la page /handovers qui « respire »
  (bandeau d'etat, memoire transmise, frise passations, a savoir).
- Section 22 : le widget continuite separe est remplace par le hero dashboard.
- .docx regenere (manuel + public/manuel.docx).

Co-Authored-By: Claude Opus 4.7 <noreply@anthropic.com>
</commit_message>
<xml_diff>
--- a/docs/MODE_EMPLOI.docx
+++ b/docs/MODE_EMPLOI.docx
@@ -798,6 +798,29 @@
       </w:r>
     </w:p>
     <w:p>
+      <w:r>
+        <w:t xml:space="preserve">Le dashboard n'est </w:t>
+      </w:r>
+      <w:r>
+        <w:rPr>
+          <w:b/>
+        </w:rPr>
+        <w:t>pas</w:t>
+      </w:r>
+      <w:r>
+        <w:t xml:space="preserve"> un tableau de KPI. C'est une surface de </w:t>
+      </w:r>
+      <w:r>
+        <w:rPr>
+          <w:b/>
+        </w:rPr>
+        <w:t>mémoire opérationnelle</w:t>
+      </w:r>
+      <w:r>
+        <w:t xml:space="preserve"> : il « apparaît au bon moment, puis se retire ». Volontairement sobre, 4 zones seulement (mai 2026 — refonte « collapse éditorial »).</w:t>
+      </w:r>
+    </w:p>
+    <w:p>
       <w:pPr>
         <w:pStyle w:val="Heading3"/>
       </w:pPr>
@@ -827,33 +850,28 @@
         <w:rPr>
           <w:b/>
         </w:rPr>
-        <w:t>Ce que les lieux disent ce matin</w:t>
-      </w:r>
-      <w:r>
-        <w:t xml:space="preserve"> (si signal IA pertinent) : 1 phrase courte qui émerge d'un site. Rare par construction. Doctrine : </w:t>
-      </w:r>
-      <w:r>
-        <w:rPr>
-          <w:i/>
-        </w:rPr>
-        <w:t>l'IA qui parle tout le temps devient du bruit</w:t>
-      </w:r>
-      <w:r>
-        <w:t>.</w:t>
-      </w:r>
-    </w:p>
-    <w:p>
-      <w:pPr>
-        <w:pStyle w:val="ListNumber"/>
-      </w:pPr>
+        <w:t>« Mémoire active ce matin »</w:t>
+      </w:r>
+      <w:r>
+        <w:t xml:space="preserve"> (le bloc principal) : </w:t>
+      </w:r>
       <w:r>
         <w:rPr>
           <w:b/>
         </w:rPr>
-        <w:t>Zone Vigilance (en rouge bordeaux, en haut)</w:t>
-      </w:r>
-      <w:r>
-        <w:t xml:space="preserve"> :</w:t>
+        <w:t>un seul message</w:t>
+      </w:r>
+      <w:r>
+        <w:t xml:space="preserve"> mis en avant (plus un secondaire au maximum), ou un </w:t>
+      </w:r>
+      <w:r>
+        <w:rPr>
+          <w:b/>
+        </w:rPr>
+        <w:t>silence assumé</w:t>
+      </w:r>
+      <w:r>
+        <w:t>. Selon ce qui mérite votre attention, il affiche :</w:t>
       </w:r>
     </w:p>
     <w:p>
@@ -862,7 +880,16 @@
         <w:ind w:left="567"/>
       </w:pPr>
       <w:r>
-        <w:t>AO à rendre dans les 7 jours (si vous en avez)</w:t>
+        <w:t xml:space="preserve">🟢 </w:t>
+      </w:r>
+      <w:r>
+        <w:rPr>
+          <w:i/>
+        </w:rPr>
+        <w:t>« Les lieux sont calmes ce matin »</w:t>
+      </w:r>
+      <w:r>
+        <w:t xml:space="preserve"> (fond vert) quand rien ne presse — et c'est très bien ;</w:t>
       </w:r>
     </w:p>
     <w:p>
@@ -871,7 +898,16 @@
         <w:ind w:left="567"/>
       </w:pPr>
       <w:r>
-        <w:t>Signalements terrain des dernières 24 h</w:t>
+        <w:t xml:space="preserve">🟠 une </w:t>
+      </w:r>
+      <w:r>
+        <w:rPr>
+          <w:b/>
+        </w:rPr>
+        <w:t>passation à préparer / en attente de reconnaissance</w:t>
+      </w:r>
+      <w:r>
+        <w:t xml:space="preserve"> (continuité) ;</w:t>
       </w:r>
     </w:p>
     <w:p>
@@ -880,7 +916,16 @@
         <w:ind w:left="567"/>
       </w:pPr>
       <w:r>
-        <w:t>Engagements à surveiller cette semaine</w:t>
+        <w:t xml:space="preserve">une </w:t>
+      </w:r>
+      <w:r>
+        <w:rPr>
+          <w:b/>
+        </w:rPr>
+        <w:t>échéance d'appel d'offres</w:t>
+      </w:r>
+      <w:r>
+        <w:t xml:space="preserve"> proche ;</w:t>
       </w:r>
     </w:p>
     <w:p>
@@ -889,7 +934,34 @@
         <w:ind w:left="567"/>
       </w:pPr>
       <w:r>
-        <w:t>Contrats sous tension</w:t>
+        <w:t xml:space="preserve">🔴 un </w:t>
+      </w:r>
+      <w:r>
+        <w:rPr>
+          <w:b/>
+        </w:rPr>
+        <w:t>signalement terrain</w:t>
+      </w:r>
+      <w:r>
+        <w:t xml:space="preserve"> récent ;</w:t>
+      </w:r>
+    </w:p>
+    <w:p>
+      <w:pPr>
+        <w:pStyle w:val="ListBullet"/>
+        <w:ind w:left="567"/>
+      </w:pPr>
+      <w:r>
+        <w:t xml:space="preserve">une </w:t>
+      </w:r>
+      <w:r>
+        <w:rPr>
+          <w:b/>
+        </w:rPr>
+        <w:t>résonance mémoire</w:t>
+      </w:r>
+      <w:r>
+        <w:t xml:space="preserve"> (« ce que les lieux disent ce matin »).</w:t>
       </w:r>
     </w:p>
     <w:p>
@@ -900,20 +972,105 @@
         <w:rPr>
           <w:b/>
         </w:rPr>
-        <w:t>Widget Pipeline AO</w:t>
-      </w:r>
-      <w:r>
-        <w:t xml:space="preserve"> : 3 chiffres (Actifs / À rendre / Gagnés ce mois). Cliquable → </w:t>
-      </w:r>
-      <w:r>
-        <w:rPr>
-          <w:rFonts w:ascii="Consolas" w:hAnsi="Consolas"/>
-          <w:sz w:val="20"/>
-        </w:rPr>
-        <w:t>/tenders</w:t>
-      </w:r>
-      <w:r>
-        <w:t>.</w:t>
+        <w:t>« Vie des lieux »</w:t>
+      </w:r>
+      <w:r>
+        <w:t xml:space="preserve"> : un </w:t>
+      </w:r>
+      <w:r>
+        <w:rPr>
+          <w:b/>
+        </w:rPr>
+        <w:t>flux unique, hiérarchisé</w:t>
+      </w:r>
+      <w:r>
+        <w:t xml:space="preserve">, regroupé en </w:t>
+      </w:r>
+      <w:r>
+        <w:rPr>
+          <w:b/>
+        </w:rPr>
+        <w:t>familles colorées</w:t>
+      </w:r>
+      <w:r>
+        <w:t xml:space="preserve"> (pas une liste plate) :</w:t>
+      </w:r>
+    </w:p>
+    <w:p>
+      <w:pPr>
+        <w:pStyle w:val="ListBullet"/>
+        <w:ind w:left="567"/>
+      </w:pPr>
+      <w:r>
+        <w:t xml:space="preserve">🔴 </w:t>
+      </w:r>
+      <w:r>
+        <w:rPr>
+          <w:b/>
+        </w:rPr>
+        <w:t>Attention opérationnelle</w:t>
+      </w:r>
+      <w:r>
+        <w:t xml:space="preserve"> (rouge) : signalements terrain, anomalies ouvertes, engagements et contrats à surveiller ;</w:t>
+      </w:r>
+    </w:p>
+    <w:p>
+      <w:pPr>
+        <w:pStyle w:val="ListBullet"/>
+        <w:ind w:left="567"/>
+      </w:pPr>
+      <w:r>
+        <w:t xml:space="preserve">🟠 </w:t>
+      </w:r>
+      <w:r>
+        <w:rPr>
+          <w:b/>
+        </w:rPr>
+        <w:t>Continuité</w:t>
+      </w:r>
+      <w:r>
+        <w:t xml:space="preserve"> (ambre) : passations reconnues / en attente ;</w:t>
+      </w:r>
+    </w:p>
+    <w:p>
+      <w:pPr>
+        <w:pStyle w:val="ListBullet"/>
+        <w:ind w:left="567"/>
+      </w:pPr>
+      <w:r>
+        <w:t xml:space="preserve">🟣 </w:t>
+      </w:r>
+      <w:r>
+        <w:rPr>
+          <w:b/>
+        </w:rPr>
+        <w:t>Appels d'offres</w:t>
+      </w:r>
+      <w:r>
+        <w:t xml:space="preserve"> (violet) : échéances ;</w:t>
+      </w:r>
+    </w:p>
+    <w:p>
+      <w:pPr>
+        <w:pStyle w:val="ListBullet"/>
+        <w:ind w:left="567"/>
+      </w:pPr>
+      <w:r>
+        <w:t xml:space="preserve">🔵 </w:t>
+      </w:r>
+      <w:r>
+        <w:rPr>
+          <w:b/>
+        </w:rPr>
+        <w:t>Mémoire terrain</w:t>
+      </w:r>
+      <w:r>
+        <w:t xml:space="preserve"> (bleu doux) : « à savoir » récents, silence inhabituel d'un site.</w:t>
+      </w:r>
+    </w:p>
+    <w:p>
+      <w:r>
+        <w:t xml:space="preserve">   Densité variable : un signal précis = une ligne normale ; un résumé (« 8 anomalies ouvertes ») = une ligne compacte.</w:t>
       </w:r>
     </w:p>
     <w:p>
@@ -924,80 +1081,82 @@
         <w:rPr>
           <w:b/>
         </w:rPr>
-        <w:t>Bouton « Préparer ma défense »</w:t>
-      </w:r>
-      <w:r>
-        <w:t xml:space="preserve"> : raccourci vers le mode litige.</w:t>
-      </w:r>
-    </w:p>
-    <w:p>
-      <w:pPr>
-        <w:pStyle w:val="ListNumber"/>
-      </w:pPr>
+        <w:t>Pied de page</w:t>
+      </w:r>
+      <w:r>
+        <w:t xml:space="preserve"> : </w:t>
+      </w:r>
+      <w:r>
+        <w:rPr>
+          <w:i/>
+        </w:rPr>
+        <w:t>« Mémoire accumulée : X interventions documentées · Y preuves »</w:t>
+      </w:r>
+      <w:r>
+        <w:t xml:space="preserve"> (votre capital, pas un KPI) + lien discret </w:t>
+      </w:r>
       <w:r>
         <w:rPr>
           <w:b/>
         </w:rPr>
-        <w:t>4 stats agrégées</w:t>
-      </w:r>
-      <w:r>
-        <w:t xml:space="preserve"> (semaine, capital, AO, anomalies).</w:t>
-      </w:r>
-    </w:p>
-    <w:p>
-      <w:pPr>
-        <w:pStyle w:val="ListNumber"/>
-      </w:pPr>
+        <w:t>« Préparer ma défense »</w:t>
+      </w:r>
+      <w:r>
+        <w:t xml:space="preserve"> (mode litige).</w:t>
+      </w:r>
+    </w:p>
+    <w:p>
+      <w:r>
+        <w:t xml:space="preserve">Les KPI volumineux, le widget Pipeline AO et le widget « Contrats sous tension » ont été </w:t>
+      </w:r>
       <w:r>
         <w:rPr>
           <w:b/>
         </w:rPr>
-        <w:t>Compteurs</w:t>
-      </w:r>
-      <w:r>
-        <w:t xml:space="preserve"> : dossiers clôturés ce mois.</w:t>
-      </w:r>
-    </w:p>
-    <w:p>
-      <w:pPr>
-        <w:pStyle w:val="ListNumber"/>
-      </w:pPr>
+        <w:t>retirés</w:t>
+      </w:r>
+      <w:r>
+        <w:t xml:space="preserve"> : ces chiffres sont accessibles via le menu de gauche (Appels d'offres, Contrats, Sites…). Le dashboard </w:t>
+      </w:r>
       <w:r>
         <w:rPr>
           <w:b/>
         </w:rPr>
-        <w:t>Liste des contrats</w:t>
-      </w:r>
-      <w:r>
-        <w:t xml:space="preserve"> : groupés par « Demandent attention », « En bonne progression », « Inactifs ».</w:t>
-      </w:r>
-    </w:p>
-    <w:p>
-      <w:pPr>
-        <w:pStyle w:val="ListNumber"/>
-      </w:pPr>
+        <w:t>pointe</w:t>
+      </w:r>
+      <w:r>
+        <w:t xml:space="preserve"> vers les pages spécialisées, il ne les recopie pas.</w:t>
+      </w:r>
+    </w:p>
+    <w:p>
+      <w:pPr>
+        <w:pStyle w:val="Heading3"/>
+      </w:pPr>
+      <w:r>
+        <w:t>D'où viennent ces signaux ?</w:t>
+      </w:r>
+    </w:p>
+    <w:p>
+      <w:r>
+        <w:t xml:space="preserve">Chaque signal de « Vie des lieux » est </w:t>
+      </w:r>
       <w:r>
         <w:rPr>
           <w:b/>
         </w:rPr>
-        <w:t>Capital cumulé</w:t>
-      </w:r>
-      <w:r>
-        <w:t xml:space="preserve"> : ligne sobre tout en bas — interventions documentées · photos · incidents traités depuis le démarrage.</w:t>
-      </w:r>
-    </w:p>
-    <w:p>
-      <w:pPr>
-        <w:pStyle w:val="ListNumber"/>
-      </w:pPr>
+        <w:t>calculé à partir de faits réels</w:t>
+      </w:r>
+      <w:r>
+        <w:t xml:space="preserve"> (dates, statuts, comptages) — jamais inventé. Le système ne montre « silence inhabituel » que s'il y a vraiment une absence de trace, « passation reconnue » que si une reconnaissance a eu lieu, etc. Le sujet est </w:t>
+      </w:r>
       <w:r>
         <w:rPr>
           <w:b/>
         </w:rPr>
-        <w:t>Activité récente</w:t>
-      </w:r>
-      <w:r>
-        <w:t xml:space="preserve"> : 8 derniers événements globaux.</w:t>
+        <w:t>toujours le lieu ou l'équipe</w:t>
+      </w:r>
+      <w:r>
+        <w:t>, jamais une personne.</w:t>
       </w:r>
     </w:p>
     <w:p>
@@ -1016,7 +1175,7 @@
         <w:t>Silence positif</w:t>
       </w:r>
       <w:r>
-        <w:t xml:space="preserve"> : si la zone vigilance est vide, c'est que tout va bien. Pas de carte qui dit « tout va bien » à votre place — c'est l'absence qui parle.</w:t>
+        <w:t xml:space="preserve"> : un matin calme affiche peu de choses — c'est voulu. Le silence donne de la valeur aux moments où le système parle. On ne remplit jamais l'écran pour se rassurer.</w:t>
       </w:r>
     </w:p>
     <w:p>
@@ -4574,6 +4733,135 @@
         <w:pStyle w:val="Heading3"/>
       </w:pPr>
       <w:r>
+        <w:t xml:space="preserve">La page </w:t>
+      </w:r>
+      <w:r>
+        <w:rPr>
+          <w:rFonts w:ascii="Consolas" w:hAnsi="Consolas"/>
+          <w:sz w:val="20"/>
+        </w:rPr>
+        <w:t>/handovers</w:t>
+      </w:r>
+      <w:r>
+        <w:t xml:space="preserve"> (vue d'ensemble vivante)</w:t>
+      </w:r>
+    </w:p>
+    <w:p>
+      <w:r>
+        <w:t xml:space="preserve">Même quand vous n'avez </w:t>
+      </w:r>
+      <w:r>
+        <w:rPr>
+          <w:b/>
+        </w:rPr>
+        <w:t>aucun brief à transmettre</w:t>
+      </w:r>
+      <w:r>
+        <w:t>, la page n'est pas vide — elle montre que la continuité est suivie :</w:t>
+      </w:r>
+    </w:p>
+    <w:p>
+      <w:pPr>
+        <w:pStyle w:val="ListBullet"/>
+      </w:pPr>
+      <w:r>
+        <w:rPr>
+          <w:b/>
+        </w:rPr>
+        <w:t>Bandeau d'état</w:t>
+      </w:r>
+      <w:r>
+        <w:t xml:space="preserve"> : 🟢 </w:t>
+      </w:r>
+      <w:r>
+        <w:rPr>
+          <w:i/>
+        </w:rPr>
+        <w:t>« Continuité stable — aucune passation urgente »</w:t>
+      </w:r>
+      <w:r>
+        <w:t xml:space="preserve"> (avec la date du dernier témoin reconnu), ou 🟠 </w:t>
+      </w:r>
+      <w:r>
+        <w:rPr>
+          <w:i/>
+        </w:rPr>
+        <w:t>« N passations à préparer cette semaine »</w:t>
+      </w:r>
+      <w:r>
+        <w:t xml:space="preserve"> si des contrats se terminent.</w:t>
+      </w:r>
+    </w:p>
+    <w:p>
+      <w:pPr>
+        <w:pStyle w:val="ListBullet"/>
+      </w:pPr>
+      <w:r>
+        <w:rPr>
+          <w:b/>
+        </w:rPr>
+        <w:t>Mémoire transmise ce mois-ci</w:t>
+      </w:r>
+      <w:r>
+        <w:t xml:space="preserve"> : le </w:t>
+      </w:r>
+      <w:r>
+        <w:rPr>
+          <w:b/>
+        </w:rPr>
+        <w:t>volume préservé</w:t>
+      </w:r>
+      <w:r>
+        <w:t xml:space="preserve"> par les passations (sites couverts, « à savoir », anomalies relayées, documents, équipes relais). C'est un volume, </w:t>
+      </w:r>
+      <w:r>
+        <w:rPr>
+          <w:b/>
+        </w:rPr>
+        <w:t>pas un score</w:t>
+      </w:r>
+      <w:r>
+        <w:t>.</w:t>
+      </w:r>
+    </w:p>
+    <w:p>
+      <w:pPr>
+        <w:pStyle w:val="ListBullet"/>
+      </w:pPr>
+      <w:r>
+        <w:rPr>
+          <w:b/>
+        </w:rPr>
+        <w:t>Dernières passations</w:t>
+      </w:r>
+      <w:r>
+        <w:t xml:space="preserve"> : une frise des derniers briefs (« reconnu par X · consulté 3 fois », « brief généré il y a 12 jours », « archivé »).</w:t>
+      </w:r>
+    </w:p>
+    <w:p>
+      <w:pPr>
+        <w:pStyle w:val="ListBullet"/>
+      </w:pPr>
+      <w:r>
+        <w:rPr>
+          <w:b/>
+        </w:rPr>
+        <w:t>À savoir, en ce moment</w:t>
+      </w:r>
+      <w:r>
+        <w:t xml:space="preserve"> : quelques consignes de site actuellement vivantes.</w:t>
+      </w:r>
+    </w:p>
+    <w:p>
+      <w:r>
+        <w:t>En dessous, les onglets habituels filtrent les briefs par statut (À transmettre / Partagé / Reconnu / Archivé).</w:t>
+      </w:r>
+    </w:p>
+    <w:p>
+      <w:pPr>
+        <w:pStyle w:val="Heading3"/>
+      </w:pPr>
+      <w:r>
         <w:t>Deux types de briefs</w:t>
       </w:r>
     </w:p>
@@ -7674,69 +7962,21 @@
         <w:pStyle w:val="Heading3"/>
       </w:pPr>
       <w:r>
-        <w:t>Le widget dashboard</w:t>
-      </w:r>
-    </w:p>
-    <w:p>
-      <w:r>
-        <w:t>Sur ton tableau de bord, si au moins une passation est à préparer dans les 30 jours, tu vois un encart compact :</w:t>
-      </w:r>
-    </w:p>
-    <w:p>
-      <w:pPr>
-        <w:pStyle w:val="ListBullet"/>
-      </w:pPr>
+        <w:t>Sur le tableau de bord</w:t>
+      </w:r>
+    </w:p>
+    <w:p>
+      <w:r>
+        <w:t xml:space="preserve">Depuis la refonte « collapse », il n'y a plus d'encart séparé : la continuité remonte directement dans le bloc </w:t>
+      </w:r>
       <w:r>
         <w:rPr>
           <w:b/>
         </w:rPr>
-        <w:t>N passations à préparer</w:t>
-      </w:r>
-      <w:r>
-        <w:t xml:space="preserve"> + détail par section (J-7, J-14, J-30)</w:t>
-      </w:r>
-    </w:p>
-    <w:p>
-      <w:pPr>
-        <w:pStyle w:val="ListBullet"/>
-      </w:pPr>
-      <w:r>
-        <w:t xml:space="preserve">Couleur </w:t>
-      </w:r>
-      <w:r>
-        <w:rPr>
-          <w:b/>
-        </w:rPr>
-        <w:t>rose</w:t>
-      </w:r>
-      <w:r>
-        <w:t xml:space="preserve"> si urgent (≤ 7j), </w:t>
-      </w:r>
-      <w:r>
-        <w:rPr>
-          <w:b/>
-        </w:rPr>
-        <w:t>ambre</w:t>
-      </w:r>
-      <w:r>
-        <w:t xml:space="preserve"> sinon, </w:t>
-      </w:r>
-      <w:r>
-        <w:rPr>
-          <w:b/>
-        </w:rPr>
-        <w:t>neutre</w:t>
-      </w:r>
-      <w:r>
-        <w:t xml:space="preserve"> si rien d'urgent.</w:t>
-      </w:r>
-    </w:p>
-    <w:p>
-      <w:pPr>
-        <w:pStyle w:val="ListBullet"/>
-      </w:pPr>
-      <w:r>
-        <w:t xml:space="preserve">Cliquable vers </w:t>
+        <w:t>« Mémoire active ce matin »</w:t>
+      </w:r>
+      <w:r>
+        <w:t xml:space="preserve">. S'il y a une passation urgente à préparer (contrat finissant ≤ 7 jours), le bandeau passe en ambre avec un lien vers </w:t>
       </w:r>
       <w:r>
         <w:rPr>
@@ -7746,10 +7986,17 @@
         <w:t>/continuite</w:t>
       </w:r>
       <w:r>
-        <w:t>.</w:t>
-      </w:r>
-    </w:p>
-    <w:p>
+        <w:t xml:space="preserve">. Sinon, il affiche </w:t>
+      </w:r>
+      <w:r>
+        <w:rPr>
+          <w:i/>
+        </w:rPr>
+        <w:t>« Continuité stable »</w:t>
+      </w:r>
+      <w:r>
+        <w:t xml:space="preserve">. </w:t>
+      </w:r>
       <w:r>
         <w:rPr>
           <w:b/>
@@ -7757,7 +8004,7 @@
         <w:t>Silence positif</w:t>
       </w:r>
       <w:r>
-        <w:t xml:space="preserve"> : si rien à préparer, le widget ne s'affiche pas du tout.</w:t>
+        <w:t xml:space="preserve"> : rien d'urgent → aucun bruit.</w:t>
       </w:r>
     </w:p>
     <w:p>

</xml_diff>

<commit_message>
docs(emploi): module Documents refondu + Atelier v2 (propositions typees)
§13 Bibliotheque : ajout unifie « Ajouter des documents », dedup (« deja la »),
indexation SELECTIVE (Indexe / Non indexe, fini « tout embedde »), rattachements
polymorphes + « + rattacher ».
§12 AO : sous-section « Des engagements aux propositions operationnelles »
(extraction -> propositions typees source-citees -> destination Obligation /
Vigilance / A savoir -> validation humaine -> contrat). .docx regenere.

Co-Authored-By: Claude Opus 4.7 <noreply@anthropic.com>
</commit_message>
<xml_diff>
--- a/docs/MODE_EMPLOI.docx
+++ b/docs/MODE_EMPLOI.docx
@@ -3592,6 +3592,164 @@
         <w:pStyle w:val="Heading3"/>
       </w:pPr>
       <w:r>
+        <w:t>Des engagements aux propositions opérationnelles</w:t>
+      </w:r>
+    </w:p>
+    <w:p>
+      <w:r>
+        <w:t xml:space="preserve">Dans l'Atelier, </w:t>
+      </w:r>
+      <w:r>
+        <w:rPr>
+          <w:b/>
+        </w:rPr>
+        <w:t>« Extraire les engagements »</w:t>
+      </w:r>
+      <w:r>
+        <w:t xml:space="preserve"> transforme l'AO en </w:t>
+      </w:r>
+      <w:r>
+        <w:rPr>
+          <w:b/>
+        </w:rPr>
+        <w:t>propositions typées</w:t>
+      </w:r>
+      <w:r>
+        <w:t xml:space="preserve"> — pas juste du texte. Chaque proposition cite </w:t>
+      </w:r>
+      <w:r>
+        <w:rPr>
+          <w:b/>
+        </w:rPr>
+        <w:t>l'extrait source</w:t>
+      </w:r>
+      <w:r>
+        <w:t xml:space="preserve"> exact (p. X · § Y) et reçoit une </w:t>
+      </w:r>
+      <w:r>
+        <w:rPr>
+          <w:b/>
+        </w:rPr>
+        <w:t>destination suggérée</w:t>
+      </w:r>
+      <w:r>
+        <w:t xml:space="preserve"> que </w:t>
+      </w:r>
+      <w:r>
+        <w:rPr>
+          <w:b/>
+        </w:rPr>
+        <w:t>vous validez</w:t>
+      </w:r>
+      <w:r>
+        <w:t xml:space="preserve"> :</w:t>
+      </w:r>
+    </w:p>
+    <w:p>
+      <w:pPr>
+        <w:pStyle w:val="ListBullet"/>
+      </w:pPr>
+      <w:r>
+        <w:rPr>
+          <w:b/>
+        </w:rPr>
+        <w:t>Obligation contrat</w:t>
+      </w:r>
+      <w:r>
+        <w:t xml:space="preserve"> → deviendra une </w:t>
+      </w:r>
+      <w:r>
+        <w:rPr>
+          <w:i/>
+        </w:rPr>
+        <w:t>promesse</w:t>
+      </w:r>
+      <w:r>
+        <w:t xml:space="preserve"> du contrat (planifiable, suivie en preuve).</w:t>
+      </w:r>
+    </w:p>
+    <w:p>
+      <w:pPr>
+        <w:pStyle w:val="ListBullet"/>
+      </w:pPr>
+      <w:r>
+        <w:rPr>
+          <w:b/>
+        </w:rPr>
+        <w:t>Vigilance</w:t>
+      </w:r>
+      <w:r>
+        <w:t xml:space="preserve"> → pénalité / point sensible → panneau </w:t>
+      </w:r>
+      <w:r>
+        <w:rPr>
+          <w:b/>
+        </w:rPr>
+        <w:t>« Points de vigilance issus de l'AO »</w:t>
+      </w:r>
+      <w:r>
+        <w:t xml:space="preserve"> sur le contrat.</w:t>
+      </w:r>
+    </w:p>
+    <w:p>
+      <w:pPr>
+        <w:pStyle w:val="ListBullet"/>
+      </w:pPr>
+      <w:r>
+        <w:rPr>
+          <w:b/>
+        </w:rPr>
+        <w:t>À savoir</w:t>
+      </w:r>
+      <w:r>
+        <w:t xml:space="preserve"> → savoir du lieu (accès, livraison…) → à </w:t>
+      </w:r>
+      <w:r>
+        <w:rPr>
+          <w:b/>
+        </w:rPr>
+        <w:t>pousser vers un site</w:t>
+      </w:r>
+      <w:r>
+        <w:t xml:space="preserve"> depuis le contrat → devient un « à savoir » de la mémoire du lieu.</w:t>
+      </w:r>
+    </w:p>
+    <w:p>
+      <w:r>
+        <w:rPr>
+          <w:b/>
+          <w:color w:val="C0392B"/>
+        </w:rPr>
+        <w:t>L'IA propose, vous validez</w:t>
+      </w:r>
+    </w:p>
+    <w:p>
+      <w:pPr>
+        <w:ind w:left="340"/>
+      </w:pPr>
+      <w:r>
+        <w:t>Rien n'est publié automatiquement. Vous corrigez le type et la destination en curation avant que ça devienne un objet opérationnel.</w:t>
+      </w:r>
+    </w:p>
+    <w:p>
+      <w:r>
+        <w:t xml:space="preserve">À la </w:t>
+      </w:r>
+      <w:r>
+        <w:rPr>
+          <w:b/>
+        </w:rPr>
+        <w:t>conversion en contrat</w:t>
+      </w:r>
+      <w:r>
+        <w:t>, les obligations deviennent les promesses ; vigilances et à savoir vont dans leurs surfaces dédiées.</w:t>
+      </w:r>
+    </w:p>
+    <w:p>
+      <w:pPr>
+        <w:pStyle w:val="Heading3"/>
+      </w:pPr>
+      <w:r>
         <w:t>Sources documentaires cliquables</w:t>
       </w:r>
     </w:p>
@@ -3992,27 +4150,256 @@
         <w:pStyle w:val="Heading3"/>
       </w:pPr>
       <w:r>
-        <w:t>Indexation</w:t>
-      </w:r>
-    </w:p>
-    <w:p>
-      <w:r>
-        <w:t xml:space="preserve">Chaque document chargé est </w:t>
-      </w:r>
-      <w:r>
-        <w:rPr>
-          <w:b/>
-        </w:rPr>
-        <w:t>automatiquement chunké et embeddé</w:t>
-      </w:r>
-      <w:r>
-        <w:t xml:space="preserve"> par l'IA. Cela alimente le matcher AO et les résonances site → document. </w:t>
-      </w:r>
-      <w:r>
-        <w:rPr>
-          <w:b/>
-        </w:rPr>
-        <w:t>Coût : quelques centimes par document.</w:t>
+        <w:t>Ajouter des documents</w:t>
+      </w:r>
+    </w:p>
+    <w:p>
+      <w:r>
+        <w:t xml:space="preserve">Un seul bouton </w:t>
+      </w:r>
+      <w:r>
+        <w:rPr>
+          <w:b/>
+        </w:rPr>
+        <w:t>« Ajouter des documents »</w:t>
+      </w:r>
+      <w:r>
+        <w:t xml:space="preserve"> : dépose </w:t>
+      </w:r>
+      <w:r>
+        <w:rPr>
+          <w:b/>
+        </w:rPr>
+        <w:t>1 ou plusieurs</w:t>
+      </w:r>
+      <w:r>
+        <w:t xml:space="preserve"> PDF. Pour chacun, MemorIA propose un </w:t>
+      </w:r>
+      <w:r>
+        <w:rPr>
+          <w:b/>
+        </w:rPr>
+        <w:t>type</w:t>
+      </w:r>
+      <w:r>
+        <w:t xml:space="preserve">, une </w:t>
+      </w:r>
+      <w:r>
+        <w:rPr>
+          <w:b/>
+        </w:rPr>
+        <w:t>couche mémoire</w:t>
+      </w:r>
+      <w:r>
+        <w:t xml:space="preserve"> et une </w:t>
+      </w:r>
+      <w:r>
+        <w:rPr>
+          <w:b/>
+        </w:rPr>
+        <w:t>indexation</w:t>
+      </w:r>
+      <w:r>
+        <w:t xml:space="preserve"> ; tu valides avant l'import. La création de </w:t>
+      </w:r>
+      <w:r>
+        <w:rPr>
+          <w:b/>
+        </w:rPr>
+        <w:t>collection</w:t>
+      </w:r>
+      <w:r>
+        <w:t xml:space="preserve"> se fait depuis la Bibliothèque (une collection = un tiroir de rangement).</w:t>
+      </w:r>
+    </w:p>
+    <w:p>
+      <w:r>
+        <w:rPr>
+          <w:b/>
+          <w:color w:val="C0392B"/>
+        </w:rPr>
+        <w:t>Doublons</w:t>
+      </w:r>
+    </w:p>
+    <w:p>
+      <w:pPr>
+        <w:ind w:left="340"/>
+      </w:pPr>
+      <w:r>
+        <w:t>Si tu importes deux fois le même fichier, MemorIA le détecte (</w:t>
+      </w:r>
+      <w:r>
+        <w:rPr>
+          <w:b/>
+        </w:rPr>
+        <w:t>« déjà là »</w:t>
+      </w:r>
+      <w:r>
+        <w:t xml:space="preserve">) et ne le duplique pas : il </w:t>
+      </w:r>
+      <w:r>
+        <w:rPr>
+          <w:b/>
+        </w:rPr>
+        <w:t>réutilise</w:t>
+      </w:r>
+      <w:r>
+        <w:t xml:space="preserve"> le document et ajoute simplement le nouveau rattachement.</w:t>
+      </w:r>
+    </w:p>
+    <w:p>
+      <w:pPr>
+        <w:pStyle w:val="Heading3"/>
+      </w:pPr>
+      <w:r>
+        <w:t>Indexation — SÉLECTIVE (plus « tout embeddé »)</w:t>
+      </w:r>
+    </w:p>
+    <w:p>
+      <w:r>
+        <w:t>Tous les documents ne méritent pas la mémoire active. Chaque doc affiche son état :</w:t>
+      </w:r>
+    </w:p>
+    <w:p>
+      <w:pPr>
+        <w:pStyle w:val="ListBullet"/>
+      </w:pPr>
+      <w:r>
+        <w:t xml:space="preserve">🟢 </w:t>
+      </w:r>
+      <w:r>
+        <w:rPr>
+          <w:b/>
+        </w:rPr>
+        <w:t>Indexé</w:t>
+      </w:r>
+      <w:r>
+        <w:t xml:space="preserve"> — embeddé, retrouvable par la recherche / les résonances (couches </w:t>
+      </w:r>
+      <w:r>
+        <w:rPr>
+          <w:i/>
+        </w:rPr>
+        <w:t>vivante</w:t>
+      </w:r>
+      <w:r>
+        <w:t xml:space="preserve"> et </w:t>
+      </w:r>
+      <w:r>
+        <w:rPr>
+          <w:i/>
+        </w:rPr>
+        <w:t>consultable</w:t>
+      </w:r>
+      <w:r>
+        <w:t>).</w:t>
+      </w:r>
+    </w:p>
+    <w:p>
+      <w:pPr>
+        <w:pStyle w:val="ListBullet"/>
+      </w:pPr>
+      <w:r>
+        <w:t xml:space="preserve">❄️ </w:t>
+      </w:r>
+      <w:r>
+        <w:rPr>
+          <w:b/>
+        </w:rPr>
+        <w:t>Non indexé</w:t>
+      </w:r>
+      <w:r>
+        <w:t xml:space="preserve"> — couche </w:t>
+      </w:r>
+      <w:r>
+        <w:rPr>
+          <w:i/>
+        </w:rPr>
+        <w:t>froide</w:t>
+      </w:r>
+      <w:r>
+        <w:t xml:space="preserve"> : stocké, </w:t>
+      </w:r>
+      <w:r>
+        <w:rPr>
+          <w:b/>
+        </w:rPr>
+        <w:t>pas d'embedding</w:t>
+      </w:r>
+      <w:r>
+        <w:t xml:space="preserve"> (factures, archives). Zéro coût IA.</w:t>
+      </w:r>
+    </w:p>
+    <w:p>
+      <w:pPr>
+        <w:pStyle w:val="ListBullet"/>
+      </w:pPr>
+      <w:r>
+        <w:rPr>
+          <w:i/>
+        </w:rPr>
+        <w:t>Indexation… / échouée</w:t>
+      </w:r>
+      <w:r>
+        <w:t xml:space="preserve"> selon le pipeline.</w:t>
+      </w:r>
+    </w:p>
+    <w:p>
+      <w:pPr>
+        <w:pStyle w:val="Heading3"/>
+      </w:pPr>
+      <w:r>
+        <w:t>Rattachements (un doc, plusieurs liens)</w:t>
+      </w:r>
+    </w:p>
+    <w:p>
+      <w:r>
+        <w:t xml:space="preserve">Un document est </w:t>
+      </w:r>
+      <w:r>
+        <w:rPr>
+          <w:b/>
+        </w:rPr>
+        <w:t>un seul nœud</w:t>
+      </w:r>
+      <w:r>
+        <w:t xml:space="preserve"> mais peut être </w:t>
+      </w:r>
+      <w:r>
+        <w:rPr>
+          <w:b/>
+        </w:rPr>
+        <w:t>rattaché à plusieurs entités</w:t>
+      </w:r>
+      <w:r>
+        <w:t xml:space="preserve"> : Contrat, Site, Client, AO, Équipe. La liste et la fiche montrent « </w:t>
+      </w:r>
+      <w:r>
+        <w:rPr>
+          <w:b/>
+        </w:rPr>
+        <w:t>Rattaché à : Contrat X · Site Z</w:t>
+      </w:r>
+      <w:r>
+        <w:t xml:space="preserve"> ». Depuis la fiche, le bouton </w:t>
+      </w:r>
+      <w:r>
+        <w:rPr>
+          <w:b/>
+        </w:rPr>
+        <w:t>« + rattacher »</w:t>
+      </w:r>
+      <w:r>
+        <w:t xml:space="preserve"> ajoute un lien (ex. relier un CCTP à un client </w:t>
+      </w:r>
+      <w:r>
+        <w:rPr>
+          <w:b/>
+        </w:rPr>
+        <w:t>et</w:t>
+      </w:r>
+      <w:r>
+        <w:t xml:space="preserve"> un AO). Jamais de doublon de document.</w:t>
       </w:r>
     </w:p>
     <w:p>

</xml_diff>

<commit_message>
docs: régénère MODE_EMPLOI.docx + public/manuel.docx (manuel à jour)
Co-Authored-By: Claude Opus 4.7 <noreply@anthropic.com>
</commit_message>
<xml_diff>
--- a/docs/MODE_EMPLOI.docx
+++ b/docs/MODE_EMPLOI.docx
@@ -4404,6 +4404,260 @@
     </w:p>
     <w:p>
       <w:pPr>
+        <w:ind w:left="340"/>
+      </w:pPr>
+      <w:r>
+        <w:t xml:space="preserve">Ranger un document dans une collection </w:t>
+      </w:r>
+      <w:r>
+        <w:rPr>
+          <w:b/>
+        </w:rPr>
+        <w:t>ne touche jamais</w:t>
+      </w:r>
+      <w:r>
+        <w:t xml:space="preserve"> ses rattachements à des sites/missions : les deux sont indépendants.</w:t>
+      </w:r>
+    </w:p>
+    <w:p>
+      <w:pPr>
+        <w:pStyle w:val="Heading3"/>
+      </w:pPr>
+      <w:r>
+        <w:t>Ranger &amp; organiser (collections)</w:t>
+      </w:r>
+    </w:p>
+    <w:p>
+      <w:r>
+        <w:t xml:space="preserve">La Bibliothèque organise les documents en </w:t>
+      </w:r>
+      <w:r>
+        <w:rPr>
+          <w:b/>
+        </w:rPr>
+        <w:t>collections</w:t>
+      </w:r>
+      <w:r>
+        <w:t xml:space="preserve"> (des tiroirs). Tu peux :</w:t>
+      </w:r>
+    </w:p>
+    <w:p>
+      <w:pPr>
+        <w:pStyle w:val="ListBullet"/>
+      </w:pPr>
+      <w:r>
+        <w:rPr>
+          <w:b/>
+        </w:rPr>
+        <w:t>Déplacer</w:t>
+      </w:r>
+      <w:r>
+        <w:t xml:space="preserve"> un document d'une collection à l'autre — par </w:t>
+      </w:r>
+      <w:r>
+        <w:rPr>
+          <w:b/>
+        </w:rPr>
+        <w:t>glisser-déposer</w:t>
+      </w:r>
+      <w:r>
+        <w:t xml:space="preserve"> sur la carte de la collection cible, ou via le menu « Déplacer vers… » de la ligne.</w:t>
+      </w:r>
+    </w:p>
+    <w:p>
+      <w:pPr>
+        <w:pStyle w:val="ListBullet"/>
+      </w:pPr>
+      <w:r>
+        <w:t xml:space="preserve">Le mettre </w:t>
+      </w:r>
+      <w:r>
+        <w:rPr>
+          <w:b/>
+        </w:rPr>
+        <w:t>« Sans collection »</w:t>
+      </w:r>
+      <w:r>
+        <w:t xml:space="preserve"> (groupe dédié pour les documents orphelins).</w:t>
+      </w:r>
+    </w:p>
+    <w:p>
+      <w:pPr>
+        <w:pStyle w:val="ListBullet"/>
+      </w:pPr>
+      <w:r>
+        <w:rPr>
+          <w:b/>
+        </w:rPr>
+        <w:t>Éditer une collection</w:t>
+      </w:r>
+      <w:r>
+        <w:t xml:space="preserve"> : la </w:t>
+      </w:r>
+      <w:r>
+        <w:rPr>
+          <w:b/>
+        </w:rPr>
+        <w:t>renommer</w:t>
+      </w:r>
+      <w:r>
+        <w:t xml:space="preserve">, la </w:t>
+      </w:r>
+      <w:r>
+        <w:rPr>
+          <w:b/>
+        </w:rPr>
+        <w:t>réordonner</w:t>
+      </w:r>
+      <w:r>
+        <w:t xml:space="preserve"> (▲▼), ou la </w:t>
+      </w:r>
+      <w:r>
+        <w:rPr>
+          <w:b/>
+        </w:rPr>
+        <w:t>supprimer</w:t>
+      </w:r>
+      <w:r>
+        <w:t xml:space="preserve"> — avec deux choix au moment de supprimer : </w:t>
+      </w:r>
+      <w:r>
+        <w:rPr>
+          <w:i/>
+        </w:rPr>
+        <w:t>« mettre les documents sans collection »</w:t>
+      </w:r>
+      <w:r>
+        <w:t xml:space="preserve"> (on garde les fichiers) ou </w:t>
+      </w:r>
+      <w:r>
+        <w:rPr>
+          <w:i/>
+        </w:rPr>
+        <w:t>« supprimer aussi les fichiers »</w:t>
+      </w:r>
+      <w:r>
+        <w:t>.</w:t>
+      </w:r>
+    </w:p>
+    <w:p>
+      <w:pPr>
+        <w:pStyle w:val="Heading3"/>
+      </w:pPr>
+      <w:r>
+        <w:t>Temps mémoriel &amp; continuité documentaire</w:t>
+      </w:r>
+    </w:p>
+    <w:p>
+      <w:r>
+        <w:t xml:space="preserve">Chaque document affiche son </w:t>
+      </w:r>
+      <w:r>
+        <w:rPr>
+          <w:b/>
+        </w:rPr>
+        <w:t>état mémoriel</w:t>
+      </w:r>
+      <w:r>
+        <w:t xml:space="preserve"> en langage clair (jamais un score) : </w:t>
+      </w:r>
+      <w:r>
+        <w:rPr>
+          <w:b/>
+        </w:rPr>
+        <w:t>Présent</w:t>
+      </w:r>
+      <w:r>
+        <w:t xml:space="preserve"> (utile activement) · </w:t>
+      </w:r>
+      <w:r>
+        <w:rPr>
+          <w:b/>
+        </w:rPr>
+        <w:t>En sommeil</w:t>
+      </w:r>
+      <w:r>
+        <w:t xml:space="preserve"> (conservé mais peu actif) · </w:t>
+      </w:r>
+      <w:r>
+        <w:rPr>
+          <w:b/>
+        </w:rPr>
+        <w:t>Clos</w:t>
+      </w:r>
+      <w:r>
+        <w:t xml:space="preserve"> (sujet traité) · </w:t>
+      </w:r>
+      <w:r>
+        <w:rPr>
+          <w:b/>
+        </w:rPr>
+        <w:t>Remplacé</w:t>
+      </w:r>
+      <w:r>
+        <w:t xml:space="preserve"> (une version plus récente existe). Quand un document en remplace un autre, le lien est </w:t>
+      </w:r>
+      <w:r>
+        <w:rPr>
+          <w:b/>
+        </w:rPr>
+        <w:t>visible</w:t>
+      </w:r>
+      <w:r>
+        <w:t xml:space="preserve"> : « Remplacé par … » / « Remplace … » — la mémoire ne disparaît jamais en silence.</w:t>
+      </w:r>
+    </w:p>
+    <w:p>
+      <w:pPr>
+        <w:pStyle w:val="Heading3"/>
+      </w:pPr>
+      <w:r>
+        <w:t>Coût IA — transparent avant le clic</w:t>
+      </w:r>
+    </w:p>
+    <w:p>
+      <w:r>
+        <w:t>À côté des boutons qui déclenchent une analyse (</w:t>
+      </w:r>
+      <w:r>
+        <w:rPr>
+          <w:b/>
+        </w:rPr>
+        <w:t>Réanalyser</w:t>
+      </w:r>
+      <w:r>
+        <w:t xml:space="preserve">, </w:t>
+      </w:r>
+      <w:r>
+        <w:rPr>
+          <w:b/>
+        </w:rPr>
+        <w:t>Importer</w:t>
+      </w:r>
+      <w:r>
+        <w:t xml:space="preserve">), une icône ⓘ affiche au survol le </w:t>
+      </w:r>
+      <w:r>
+        <w:rPr>
+          <w:b/>
+        </w:rPr>
+        <w:t>coût IA indicatif en XPF</w:t>
+      </w:r>
+      <w:r>
+        <w:t xml:space="preserve"> : la </w:t>
+      </w:r>
+      <w:r>
+        <w:rPr>
+          <w:b/>
+        </w:rPr>
+        <w:t>moyenne observée</w:t>
+      </w:r>
+      <w:r>
+        <w:t xml:space="preserve"> des dernières analyses du même type (pas une estimation théorique). S'il n'y a pas encore d'historique, MemorIA le dit (« coût mesuré dès la 1ʳᵉ analyse »). Visible pour managers et admins.</w:t>
+      </w:r>
+    </w:p>
+    <w:p>
+      <w:pPr>
         <w:jc w:val="center"/>
       </w:pPr>
       <w:r>
@@ -4965,6 +5219,115 @@
         <w:pStyle w:val="Heading3"/>
       </w:pPr>
       <w:r>
+        <w:t>Quand une personne s'en va — l'offboarding guidé</w:t>
+      </w:r>
+    </w:p>
+    <w:p>
+      <w:r>
+        <w:t>Sur la fiche (manager/admin, jamais sa propre fiche), deux actions en haut :</w:t>
+      </w:r>
+    </w:p>
+    <w:p>
+      <w:pPr>
+        <w:pStyle w:val="ListBullet"/>
+      </w:pPr>
+      <w:r>
+        <w:rPr>
+          <w:b/>
+        </w:rPr>
+        <w:t>« Préparer un passage de témoin »</w:t>
+      </w:r>
+      <w:r>
+        <w:t xml:space="preserve"> — génère directement le brief (voir chapitre 15).</w:t>
+      </w:r>
+    </w:p>
+    <w:p>
+      <w:pPr>
+        <w:pStyle w:val="ListBullet"/>
+      </w:pPr>
+      <w:r>
+        <w:rPr>
+          <w:b/>
+        </w:rPr>
+        <w:t>L'offboarding guidé</w:t>
+      </w:r>
+      <w:r>
+        <w:t xml:space="preserve"> enchaîne en un seul geste les 3 étapes d'un départ :</w:t>
+      </w:r>
+    </w:p>
+    <w:p>
+      <w:pPr>
+        <w:pStyle w:val="ListNumber"/>
+        <w:ind w:left="567"/>
+      </w:pPr>
+      <w:r>
+        <w:rPr>
+          <w:b/>
+        </w:rPr>
+        <w:t>Date de fin de contrat</w:t>
+      </w:r>
+      <w:r>
+        <w:t xml:space="preserve"> (obligatoire) — elle alimente le radar « À anticiper » et </w:t>
+      </w:r>
+      <w:r>
+        <w:rPr>
+          <w:b/>
+        </w:rPr>
+        <w:t>devient la date d'effet</w:t>
+      </w:r>
+      <w:r>
+        <w:t xml:space="preserve"> du passage de témoin.</w:t>
+      </w:r>
+    </w:p>
+    <w:p>
+      <w:pPr>
+        <w:pStyle w:val="ListNumber"/>
+        <w:ind w:left="567"/>
+      </w:pPr>
+      <w:r>
+        <w:rPr>
+          <w:b/>
+        </w:rPr>
+        <w:t>Passation</w:t>
+      </w:r>
+      <w:r>
+        <w:t xml:space="preserve"> — choix de l'équipe qui reprend, génération du brief.</w:t>
+      </w:r>
+    </w:p>
+    <w:p>
+      <w:pPr>
+        <w:pStyle w:val="ListNumber"/>
+        <w:ind w:left="567"/>
+      </w:pPr>
+      <w:r>
+        <w:rPr>
+          <w:b/>
+        </w:rPr>
+        <w:t>Désactivation du compte</w:t>
+      </w:r>
+      <w:r>
+        <w:t xml:space="preserve"> (admin uniquement).</w:t>
+      </w:r>
+    </w:p>
+    <w:p>
+      <w:r>
+        <w:t xml:space="preserve">Le sujet reste </w:t>
+      </w:r>
+      <w:r>
+        <w:rPr>
+          <w:b/>
+        </w:rPr>
+        <w:t>la mémoire transmise</w:t>
+      </w:r>
+      <w:r>
+        <w:t>, jamais la personne.</w:t>
+      </w:r>
+    </w:p>
+    <w:p>
+      <w:pPr>
+        <w:pStyle w:val="Heading3"/>
+      </w:pPr>
+      <w:r>
         <w:t>Quand l'utiliser</w:t>
       </w:r>
     </w:p>
@@ -5309,6 +5672,148 @@
         <w:rPr>
           <w:b/>
         </w:rPr>
+        <w:t>Manager + admin uniquement</w:t>
+      </w:r>
+      <w:r>
+        <w:t xml:space="preserve"> (self exclu — une personne ne génère pas son propre brief, garde-fou appliqué côté serveur).</w:t>
+      </w:r>
+    </w:p>
+    <w:p>
+      <w:r>
+        <w:t>Trois portes d'entrée, toutes vers le même brief :</w:t>
+      </w:r>
+    </w:p>
+    <w:p>
+      <w:pPr>
+        <w:pStyle w:val="ListBullet"/>
+      </w:pPr>
+      <w:r>
+        <w:t xml:space="preserve">Depuis </w:t>
+      </w:r>
+      <w:r>
+        <w:rPr>
+          <w:b/>
+        </w:rPr>
+        <w:t>`/handovers`</w:t>
+      </w:r>
+      <w:r>
+        <w:t xml:space="preserve"> → bouton </w:t>
+      </w:r>
+      <w:r>
+        <w:rPr>
+          <w:b/>
+        </w:rPr>
+        <w:t>« Préparer une passation (une personne change d'équipe) »</w:t>
+      </w:r>
+      <w:r>
+        <w:t xml:space="preserve"> : un sélecteur s'ouvre, tu choisis directement la personne — pas besoin d'aller la chercher dans la liste.</w:t>
+      </w:r>
+    </w:p>
+    <w:p>
+      <w:pPr>
+        <w:pStyle w:val="ListBullet"/>
+      </w:pPr>
+      <w:r>
+        <w:t xml:space="preserve">Depuis </w:t>
+      </w:r>
+      <w:r>
+        <w:rPr>
+          <w:b/>
+        </w:rPr>
+        <w:t>`/intervenants/[id]`</w:t>
+      </w:r>
+      <w:r>
+        <w:t xml:space="preserve"> → bouton </w:t>
+      </w:r>
+      <w:r>
+        <w:rPr>
+          <w:b/>
+        </w:rPr>
+        <w:t>« Préparer un passage de témoin »</w:t>
+      </w:r>
+      <w:r>
+        <w:t>.</w:t>
+      </w:r>
+    </w:p>
+    <w:p>
+      <w:pPr>
+        <w:pStyle w:val="ListBullet"/>
+      </w:pPr>
+      <w:r>
+        <w:t>Depuis l'</w:t>
+      </w:r>
+      <w:r>
+        <w:rPr>
+          <w:b/>
+        </w:rPr>
+        <w:t>offboarding guidé</w:t>
+      </w:r>
+      <w:r>
+        <w:t xml:space="preserve"> (départ d'une personne, voir chapitre 14) — la passation y est l'étape 2.</w:t>
+      </w:r>
+    </w:p>
+    <w:p>
+      <w:r>
+        <w:t>Tu choisis :</w:t>
+      </w:r>
+    </w:p>
+    <w:p>
+      <w:pPr>
+        <w:pStyle w:val="ListBullet"/>
+      </w:pPr>
+      <w:r>
+        <w:rPr>
+          <w:b/>
+        </w:rPr>
+        <w:t>La date d'effet</w:t>
+      </w:r>
+      <w:r>
+        <w:t xml:space="preserve"> (à partir de quand la personne est remplacée) — </w:t>
+      </w:r>
+      <w:r>
+        <w:rPr>
+          <w:b/>
+        </w:rPr>
+        <w:t>obligatoire</w:t>
+      </w:r>
+      <w:r>
+        <w:t>.</w:t>
+      </w:r>
+    </w:p>
+    <w:p>
+      <w:pPr>
+        <w:pStyle w:val="ListBullet"/>
+      </w:pPr>
+      <w:r>
+        <w:t>L'équipe d'origine (optionnel — sinon toutes ses équipes actives).</w:t>
+      </w:r>
+    </w:p>
+    <w:p>
+      <w:pPr>
+        <w:pStyle w:val="ListBullet"/>
+      </w:pPr>
+      <w:r>
+        <w:t>L'équipe de destination (optionnel).</w:t>
+      </w:r>
+    </w:p>
+    <w:p>
+      <w:r>
+        <w:t>MemorIA compile un brief multi-sites focalisé sur ce que cette personne couvrait.</w:t>
+      </w:r>
+    </w:p>
+    <w:p>
+      <w:pPr>
+        <w:pStyle w:val="Heading4"/>
+      </w:pPr>
+      <w:r>
+        <w:t>Type 2 — Prise de nouveau site</w:t>
+      </w:r>
+    </w:p>
+    <w:p>
+      <w:r>
+        <w:rPr>
+          <w:b/>
+        </w:rPr>
         <w:t>Déclenché depuis</w:t>
       </w:r>
       <w:r>
@@ -5319,7 +5824,7 @@
           <w:rFonts w:ascii="Consolas" w:hAnsi="Consolas"/>
           <w:sz w:val="20"/>
         </w:rPr>
-        <w:t>/intervenants/[id]</w:t>
+        <w:t>/equipes/[id]</w:t>
       </w:r>
       <w:r>
         <w:t xml:space="preserve"> → bouton </w:t>
@@ -5328,19 +5833,7 @@
         <w:rPr>
           <w:b/>
         </w:rPr>
-        <w:t>« Préparer un passage de témoin »</w:t>
-      </w:r>
-      <w:r>
-        <w:t xml:space="preserve"> </w:t>
-      </w:r>
-      <w:r>
-        <w:rPr>
-          <w:b/>
-        </w:rPr>
-        <w:t>Manager + admin uniquement</w:t>
-      </w:r>
-      <w:r>
-        <w:t xml:space="preserve"> (self exclu — une personne ne génère pas son propre brief)</w:t>
+        <w:t>« Brief pour une prise de site »</w:t>
       </w:r>
     </w:p>
     <w:p>
@@ -5353,7 +5846,7 @@
         <w:pStyle w:val="ListBullet"/>
       </w:pPr>
       <w:r>
-        <w:t>L'équipe d'origine de la personne (optionnel — sinon prend toutes ses équipes actives)</w:t>
+        <w:t>Le site que l'équipe va prendre.</w:t>
       </w:r>
     </w:p>
     <w:p>
@@ -5361,52 +5854,104 @@
         <w:pStyle w:val="ListBullet"/>
       </w:pPr>
       <w:r>
-        <w:t>L'équipe de destination (optionnel)</w:t>
-      </w:r>
-    </w:p>
-    <w:p>
-      <w:r>
-        <w:t>MemorIA compile un brief multi-sites focalisé sur ce que cette personne couvrait.</w:t>
-      </w:r>
-    </w:p>
-    <w:p>
-      <w:pPr>
-        <w:pStyle w:val="Heading4"/>
-      </w:pPr>
-      <w:r>
-        <w:t>Type 2 — Prise de nouveau site</w:t>
-      </w:r>
-    </w:p>
-    <w:p>
-      <w:r>
-        <w:rPr>
-          <w:b/>
-        </w:rPr>
-        <w:t>Déclenché depuis</w:t>
-      </w:r>
-      <w:r>
-        <w:t xml:space="preserve"> </w:t>
+        <w:rPr>
+          <w:b/>
+        </w:rPr>
+        <w:t>La date d'effet</w:t>
+      </w:r>
+      <w:r>
+        <w:t xml:space="preserve"> (à partir de quand l'équipe prend le site) — </w:t>
+      </w:r>
+      <w:r>
+        <w:rPr>
+          <w:b/>
+        </w:rPr>
+        <w:t>obligatoire</w:t>
+      </w:r>
+      <w:r>
+        <w:t>.</w:t>
+      </w:r>
+    </w:p>
+    <w:p>
+      <w:r>
+        <w:t>MemorIA compile un brief mono-site avec toute la mémoire accumulée par les équipes précédentes.</w:t>
+      </w:r>
+    </w:p>
+    <w:p>
+      <w:pPr>
+        <w:ind w:left="340"/>
+      </w:pPr>
+      <w:r>
+        <w:rPr>
+          <w:b/>
+        </w:rPr>
+        <w:t>La date d'effet</w:t>
+      </w:r>
+      <w:r>
+        <w:t xml:space="preserve"> s'affiche en évidence sur le brief, sur la page publique et sur le PDF (« Effectif à partir du … »). Elle dit clairement à la relève à partir de quand elle est responsable.</w:t>
+      </w:r>
+    </w:p>
+    <w:p>
+      <w:pPr>
+        <w:pStyle w:val="Heading3"/>
+      </w:pPr>
+      <w:r>
+        <w:t>Le contenu du brief</w:t>
+      </w:r>
+    </w:p>
+    <w:p>
+      <w:r>
+        <w:t>Pour chaque site concerné, MemorIA inclut :</w:t>
+      </w:r>
+    </w:p>
+    <w:p>
+      <w:pPr>
+        <w:pStyle w:val="ListBullet"/>
+      </w:pPr>
+      <w:r>
+        <w:t xml:space="preserve">📌 </w:t>
+      </w:r>
+      <w:r>
+        <w:rPr>
+          <w:b/>
+        </w:rPr>
+        <w:t>À savoir</w:t>
+      </w:r>
+      <w:r>
+        <w:t xml:space="preserve"> : consignes persistantes actives du site (8 max)</w:t>
+      </w:r>
+    </w:p>
+    <w:p>
+      <w:pPr>
+        <w:pStyle w:val="ListBullet"/>
+      </w:pPr>
+      <w:r>
+        <w:t xml:space="preserve">🚨 </w:t>
+      </w:r>
+      <w:r>
+        <w:rPr>
+          <w:b/>
+        </w:rPr>
+        <w:t>Anomalies actives</w:t>
+      </w:r>
+      <w:r>
+        <w:t xml:space="preserve"> : </w:t>
       </w:r>
       <w:r>
         <w:rPr>
           <w:rFonts w:ascii="Consolas" w:hAnsi="Consolas"/>
           <w:sz w:val="20"/>
         </w:rPr>
-        <w:t>/equipes/[id]</w:t>
-      </w:r>
-      <w:r>
-        <w:t xml:space="preserve"> → bouton </w:t>
-      </w:r>
-      <w:r>
-        <w:rPr>
-          <w:b/>
-        </w:rPr>
-        <w:t>« Brief pour une prise de site »</w:t>
-      </w:r>
-    </w:p>
-    <w:p>
-      <w:r>
-        <w:t>Tu choisis :</w:t>
+        <w:t>status='open'</w:t>
+      </w:r>
+      <w:r>
+        <w:t xml:space="preserve"> + 90 derniers jours uniquement (5 max). </w:t>
+      </w:r>
+      <w:r>
+        <w:rPr>
+          <w:b/>
+        </w:rPr>
+        <w:t>Pas de bruit historique.</w:t>
       </w:r>
     </w:p>
     <w:p>
@@ -5414,12 +5959,64 @@
         <w:pStyle w:val="ListBullet"/>
       </w:pPr>
       <w:r>
-        <w:t>Le site que l'équipe va prendre</w:t>
-      </w:r>
-    </w:p>
-    <w:p>
-      <w:r>
-        <w:t>MemorIA compile un brief mono-site avec toute la mémoire accumulée par les équipes précédentes.</w:t>
+        <w:t xml:space="preserve">📄 </w:t>
+      </w:r>
+      <w:r>
+        <w:rPr>
+          <w:b/>
+        </w:rPr>
+        <w:t>Documents rattachés</w:t>
+      </w:r>
+      <w:r>
+        <w:t xml:space="preserve"> : plans d'accès, codes badge, protocoles — sauf litiges (exclus automatiquement)</w:t>
+      </w:r>
+    </w:p>
+    <w:p>
+      <w:pPr>
+        <w:pStyle w:val="ListBullet"/>
+      </w:pPr>
+      <w:r>
+        <w:t xml:space="preserve">👥 </w:t>
+      </w:r>
+      <w:r>
+        <w:rPr>
+          <w:b/>
+        </w:rPr>
+        <w:t>Équipes voisines</w:t>
+      </w:r>
+      <w:r>
+        <w:t xml:space="preserve"> : qui d'autre connaît ce site, pour back-up (4 max)</w:t>
+      </w:r>
+    </w:p>
+    <w:p>
+      <w:pPr>
+        <w:pStyle w:val="ListBullet"/>
+      </w:pPr>
+      <w:r>
+        <w:t xml:space="preserve">🔢 </w:t>
+      </w:r>
+      <w:r>
+        <w:rPr>
+          <w:b/>
+        </w:rPr>
+        <w:t>Compteurs</w:t>
+      </w:r>
+      <w:r>
+        <w:t xml:space="preserve"> : nombre d'interventions documentées + dernière date</w:t>
+      </w:r>
+    </w:p>
+    <w:p>
+      <w:r>
+        <w:t xml:space="preserve">Plus une </w:t>
+      </w:r>
+      <w:r>
+        <w:rPr>
+          <w:b/>
+        </w:rPr>
+        <w:t>zone de notes manager</w:t>
+      </w:r>
+      <w:r>
+        <w:t xml:space="preserve"> que tu peux ajouter (« Pascal préfère WhatsApp »).</w:t>
       </w:r>
     </w:p>
     <w:p>
@@ -5427,142 +6024,60 @@
         <w:pStyle w:val="Heading3"/>
       </w:pPr>
       <w:r>
-        <w:t>Le contenu du brief</w:t>
-      </w:r>
-    </w:p>
-    <w:p>
-      <w:r>
-        <w:t>Pour chaque site concerné, MemorIA inclut :</w:t>
-      </w:r>
-    </w:p>
-    <w:p>
-      <w:pPr>
-        <w:pStyle w:val="ListBullet"/>
-      </w:pPr>
-      <w:r>
-        <w:t xml:space="preserve">📌 </w:t>
-      </w:r>
-      <w:r>
-        <w:rPr>
-          <w:b/>
-        </w:rPr>
-        <w:t>À savoir</w:t>
-      </w:r>
-      <w:r>
-        <w:t xml:space="preserve"> : consignes persistantes actives du site (8 max)</w:t>
-      </w:r>
-    </w:p>
-    <w:p>
-      <w:pPr>
-        <w:pStyle w:val="ListBullet"/>
-      </w:pPr>
-      <w:r>
-        <w:t xml:space="preserve">🚨 </w:t>
-      </w:r>
-      <w:r>
-        <w:rPr>
-          <w:b/>
-        </w:rPr>
-        <w:t>Anomalies actives</w:t>
-      </w:r>
-      <w:r>
-        <w:t xml:space="preserve"> : </w:t>
+        <w:t xml:space="preserve">Le partage public </w:t>
       </w:r>
       <w:r>
         <w:rPr>
           <w:rFonts w:ascii="Consolas" w:hAnsi="Consolas"/>
           <w:sz w:val="20"/>
         </w:rPr>
-        <w:t>status='open'</w:t>
-      </w:r>
-      <w:r>
-        <w:t xml:space="preserve"> + 90 derniers jours uniquement (5 max). </w:t>
-      </w:r>
-      <w:r>
-        <w:rPr>
-          <w:b/>
-        </w:rPr>
-        <w:t>Pas de bruit historique.</w:t>
-      </w:r>
-    </w:p>
-    <w:p>
-      <w:pPr>
-        <w:pStyle w:val="ListBullet"/>
-      </w:pPr>
-      <w:r>
-        <w:t xml:space="preserve">📄 </w:t>
-      </w:r>
-      <w:r>
-        <w:rPr>
-          <w:b/>
-        </w:rPr>
-        <w:t>Documents rattachés</w:t>
-      </w:r>
-      <w:r>
-        <w:t xml:space="preserve"> : plans d'accès, codes badge, protocoles — sauf litiges (exclus automatiquement)</w:t>
-      </w:r>
-    </w:p>
-    <w:p>
-      <w:pPr>
-        <w:pStyle w:val="ListBullet"/>
-      </w:pPr>
-      <w:r>
-        <w:t xml:space="preserve">👥 </w:t>
-      </w:r>
-      <w:r>
-        <w:rPr>
-          <w:b/>
-        </w:rPr>
-        <w:t>Équipes voisines</w:t>
-      </w:r>
-      <w:r>
-        <w:t xml:space="preserve"> : qui d'autre connaît ce site, pour back-up (4 max)</w:t>
-      </w:r>
-    </w:p>
-    <w:p>
-      <w:pPr>
-        <w:pStyle w:val="ListBullet"/>
-      </w:pPr>
-      <w:r>
-        <w:t xml:space="preserve">🔢 </w:t>
-      </w:r>
-      <w:r>
-        <w:rPr>
-          <w:b/>
-        </w:rPr>
-        <w:t>Compteurs</w:t>
-      </w:r>
-      <w:r>
-        <w:t xml:space="preserve"> : nombre d'interventions documentées + dernière date</w:t>
-      </w:r>
-    </w:p>
-    <w:p>
-      <w:r>
-        <w:t xml:space="preserve">Plus une </w:t>
-      </w:r>
-      <w:r>
-        <w:rPr>
-          <w:b/>
-        </w:rPr>
-        <w:t>zone de notes manager</w:t>
-      </w:r>
-      <w:r>
-        <w:t xml:space="preserve"> que tu peux ajouter (« Pascal préfère WhatsApp »).</w:t>
-      </w:r>
-    </w:p>
-    <w:p>
-      <w:pPr>
-        <w:pStyle w:val="Heading3"/>
-      </w:pPr>
-      <w:r>
-        <w:t xml:space="preserve">Le partage public </w:t>
+        <w:t>/h/[token]</w:t>
+      </w:r>
+    </w:p>
+    <w:p>
+      <w:pPr>
+        <w:pStyle w:val="ListNumber"/>
+      </w:pPr>
+      <w:r>
+        <w:t xml:space="preserve">Sur la page du brief, tu cliques </w:t>
+      </w:r>
+      <w:r>
+        <w:rPr>
+          <w:b/>
+        </w:rPr>
+        <w:t>« Partager (URL publique) »</w:t>
+      </w:r>
+    </w:p>
+    <w:p>
+      <w:pPr>
+        <w:pStyle w:val="ListNumber"/>
+      </w:pPr>
+      <w:r>
+        <w:t>Tu choisis la durée (1 à 60 jours)</w:t>
+      </w:r>
+    </w:p>
+    <w:p>
+      <w:pPr>
+        <w:pStyle w:val="ListNumber"/>
+      </w:pPr>
+      <w:r>
+        <w:t xml:space="preserve">MemorIA génère un </w:t>
+      </w:r>
+      <w:r>
+        <w:rPr>
+          <w:b/>
+        </w:rPr>
+        <w:t>QR code</w:t>
+      </w:r>
+      <w:r>
+        <w:t xml:space="preserve"> + une URL </w:t>
       </w:r>
       <w:r>
         <w:rPr>
           <w:rFonts w:ascii="Consolas" w:hAnsi="Consolas"/>
           <w:sz w:val="20"/>
         </w:rPr>
-        <w:t>/h/[token]</w:t>
+        <w:t>https://memoria.exemple.fr/h/abc123xyz...</w:t>
       </w:r>
     </w:p>
     <w:p>
@@ -5570,13 +6085,7 @@
         <w:pStyle w:val="ListNumber"/>
       </w:pPr>
       <w:r>
-        <w:t xml:space="preserve">Sur la page du brief, tu cliques </w:t>
-      </w:r>
-      <w:r>
-        <w:rPr>
-          <w:b/>
-        </w:rPr>
-        <w:t>« Partager (URL publique) »</w:t>
+        <w:t>Tu screenshotes le QR → tu l'envoies sur WhatsApp à Joseph</w:t>
       </w:r>
     </w:p>
     <w:p>
@@ -5584,7 +6093,22 @@
         <w:pStyle w:val="ListNumber"/>
       </w:pPr>
       <w:r>
-        <w:t>Tu choisis la durée (1 à 60 jours)</w:t>
+        <w:t xml:space="preserve">Joseph ouvre sur son téléphone </w:t>
+      </w:r>
+      <w:r>
+        <w:rPr>
+          <w:b/>
+        </w:rPr>
+        <w:t>sans login</w:t>
+      </w:r>
+      <w:r>
+        <w:t xml:space="preserve">, lit le brief, clique </w:t>
+      </w:r>
+      <w:r>
+        <w:rPr>
+          <w:b/>
+        </w:rPr>
+        <w:t>« C'est lu, j'ai compris »</w:t>
       </w:r>
     </w:p>
     <w:p>
@@ -5592,76 +6116,103 @@
         <w:pStyle w:val="ListNumber"/>
       </w:pPr>
       <w:r>
-        <w:t xml:space="preserve">MemorIA génère un </w:t>
-      </w:r>
-      <w:r>
-        <w:rPr>
-          <w:b/>
-        </w:rPr>
-        <w:t>QR code</w:t>
-      </w:r>
-      <w:r>
-        <w:t xml:space="preserve"> + une URL </w:t>
+        <w:t>Côté admin, le brief bascule en « Reconnu » avec horodatage</w:t>
+      </w:r>
+    </w:p>
+    <w:p>
+      <w:r>
+        <w:t xml:space="preserve">Le QR et l'URL sont </w:t>
+      </w:r>
+      <w:r>
+        <w:rPr>
+          <w:b/>
+        </w:rPr>
+        <w:t>mobile-first</w:t>
+      </w:r>
+      <w:r>
+        <w:t xml:space="preserve"> — pensés pour être lus à 5h30 sous la lumière d'un parking.</w:t>
+      </w:r>
+    </w:p>
+    <w:p>
+      <w:r>
+        <w:t xml:space="preserve">Côté manager, une fois le lien généré, la page du brief offre : </w:t>
+      </w:r>
+      <w:r>
+        <w:rPr>
+          <w:b/>
+        </w:rPr>
+        <w:t>Copier l'URL</w:t>
+      </w:r>
+      <w:r>
+        <w:t xml:space="preserve">, </w:t>
+      </w:r>
+      <w:r>
+        <w:rPr>
+          <w:b/>
+        </w:rPr>
+        <w:t>Code QR</w:t>
+      </w:r>
+      <w:r>
+        <w:t xml:space="preserve"> (à montrer ou imprimer pour que la relève scanne), et </w:t>
+      </w:r>
+      <w:r>
+        <w:rPr>
+          <w:b/>
+        </w:rPr>
+        <w:t>PDF</w:t>
+      </w:r>
+      <w:r>
+        <w:t>.</w:t>
+      </w:r>
+    </w:p>
+    <w:p>
+      <w:pPr>
+        <w:pStyle w:val="Heading3"/>
+      </w:pPr>
+      <w:r>
+        <w:t>Le PDF imprimable</w:t>
+      </w:r>
+    </w:p>
+    <w:p>
+      <w:r>
+        <w:t xml:space="preserve">Chaque brief partagé peut être </w:t>
+      </w:r>
+      <w:r>
+        <w:rPr>
+          <w:b/>
+        </w:rPr>
+        <w:t>téléchargé en PDF</w:t>
+      </w:r>
+      <w:r>
+        <w:t xml:space="preserve"> (depuis la page du brief, le dialog QR, ou la page publique </w:t>
       </w:r>
       <w:r>
         <w:rPr>
           <w:rFonts w:ascii="Consolas" w:hAnsi="Consolas"/>
           <w:sz w:val="20"/>
         </w:rPr>
-        <w:t>https://memoria.exemple.fr/h/abc123xyz...</w:t>
-      </w:r>
-    </w:p>
-    <w:p>
-      <w:pPr>
-        <w:pStyle w:val="ListNumber"/>
-      </w:pPr>
-      <w:r>
-        <w:t>Tu screenshotes le QR → tu l'envoies sur WhatsApp à Joseph</w:t>
-      </w:r>
-    </w:p>
-    <w:p>
-      <w:pPr>
-        <w:pStyle w:val="ListNumber"/>
-      </w:pPr>
-      <w:r>
-        <w:t xml:space="preserve">Joseph ouvre sur son téléphone </w:t>
-      </w:r>
-      <w:r>
-        <w:rPr>
-          <w:b/>
-        </w:rPr>
-        <w:t>sans login</w:t>
-      </w:r>
-      <w:r>
-        <w:t xml:space="preserve">, lit le brief, clique </w:t>
-      </w:r>
-      <w:r>
-        <w:rPr>
-          <w:b/>
-        </w:rPr>
-        <w:t>« C'est lu, j'ai compris »</w:t>
-      </w:r>
-    </w:p>
-    <w:p>
-      <w:pPr>
-        <w:pStyle w:val="ListNumber"/>
-      </w:pPr>
-      <w:r>
-        <w:t>Côté admin, le brief bascule en « Reconnu » avec horodatage</w:t>
-      </w:r>
-    </w:p>
-    <w:p>
-      <w:r>
-        <w:t xml:space="preserve">Le QR et l'URL sont </w:t>
-      </w:r>
-      <w:r>
-        <w:rPr>
-          <w:b/>
-        </w:rPr>
-        <w:t>mobile-first</w:t>
-      </w:r>
-      <w:r>
-        <w:t xml:space="preserve"> — pensés pour être lus à 5h30 sous la lumière d'un parking.</w:t>
+        <w:t>/h/[token]</w:t>
+      </w:r>
+      <w:r>
+        <w:t xml:space="preserve"> → « Télécharger le PDF »). Utile pour la relève sans téléphone sous la main, ou pour archiver. Le PDF reprend tout le contenu (contexte, sites, à savoir, anomalies, documents, équipes voisines), la </w:t>
+      </w:r>
+      <w:r>
+        <w:rPr>
+          <w:b/>
+        </w:rPr>
+        <w:t>date d'effet</w:t>
+      </w:r>
+      <w:r>
+        <w:t xml:space="preserve">, et un </w:t>
+      </w:r>
+      <w:r>
+        <w:rPr>
+          <w:b/>
+        </w:rPr>
+        <w:t>QR en pied de page</w:t>
+      </w:r>
+      <w:r>
+        <w:t xml:space="preserve"> vers la version en ligne. Le nom de fichier est neutre (ne contient pas le nom de la personne).</w:t>
       </w:r>
     </w:p>
     <w:p>
@@ -5845,6 +6396,34 @@
       </w:r>
       <w:r>
         <w:t xml:space="preserve"> avec compteurs.</w:t>
+      </w:r>
+    </w:p>
+    <w:p>
+      <w:pPr>
+        <w:pStyle w:val="ListBullet"/>
+      </w:pPr>
+      <w:r>
+        <w:rPr>
+          <w:b/>
+        </w:rPr>
+        <w:t>Archiver</w:t>
+      </w:r>
+      <w:r>
+        <w:t xml:space="preserve"> : met le brief de côté ; il reste consultable dans l'onglet « Archivé ».</w:t>
+      </w:r>
+    </w:p>
+    <w:p>
+      <w:pPr>
+        <w:pStyle w:val="ListBullet"/>
+      </w:pPr>
+      <w:r>
+        <w:rPr>
+          <w:b/>
+        </w:rPr>
+        <w:t>Supprimer</w:t>
+      </w:r>
+      <w:r>
+        <w:t xml:space="preserve"> : le brief disparaît de l'application et son lien public cesse de répondre. La donnée n'est pas détruite (restaurable par un administrateur) — fidèle à la doctrine « on ne détruit pas la mémoire ». Confirmation explicite, action tracée.</w:t>
       </w:r>
     </w:p>
     <w:p>

</xml_diff>